<commit_message>
Rebuild science course for family experience
</commit_message>
<xml_diff>
--- a/teacher-resources/program/teacher-program-v2.0.0.docx
+++ b/teacher-resources/program/teacher-program-v2.0.0.docx
@@ -74,7 +74,6 @@
         <w:gridCol w:w="3000"/>
         <w:gridCol w:w="1800"/>
         <w:gridCol w:w="5200"/>
-        <w:gridCol w:w="2698"/>
       </w:tblGrid>
       <w:tr>
         <w:trPr>
@@ -186,33 +185,6 @@
                 <w:sz w:val="17"/>
               </w:rPr>
               <w:t>Teaching-learning / evidence summary</w:t>
-            </w:r>
-          </w:p>
-        </w:tc>
-        <w:tc>
-          <w:tcPr>
-            <w:tcW w:type="dxa" w:w="2698"/>
-            <w:shd w:fill="E8EEF5"/>
-            <w:tcMar>
-              <w:top w:w="60" w:type="dxa"/>
-              <w:start w:w="90" w:type="dxa"/>
-              <w:bottom w:w="60" w:type="dxa"/>
-              <w:end w:w="90" w:type="dxa"/>
-            </w:tcMar>
-            <w:vAlign w:val="center"/>
-          </w:tcPr>
-          <w:p>
-            <w:pPr>
-              <w:spacing w:before="0" w:after="0" w:line="240" w:lineRule="auto"/>
-            </w:pPr>
-            <w:r>
-              <w:rPr>
-                <w:rFonts w:ascii="Calibri" w:hAnsi="Calibri"/>
-                <w:b/>
-                <w:color w:val="1F4D78"/>
-                <w:sz w:val="17"/>
-              </w:rPr>
-              <w:t>Website pathway</w:t>
             </w:r>
           </w:p>
         </w:tc>
@@ -393,85 +365,6 @@
             </w:r>
           </w:p>
         </w:tc>
-        <w:tc>
-          <w:tcPr>
-            <w:tcW w:type="dxa" w:w="2698"/>
-            <w:tcMar>
-              <w:top w:w="60" w:type="dxa"/>
-              <w:start w:w="90" w:type="dxa"/>
-              <w:bottom w:w="60" w:type="dxa"/>
-              <w:end w:w="90" w:type="dxa"/>
-            </w:tcMar>
-            <w:vAlign w:val="center"/>
-          </w:tcPr>
-          <w:p>
-            <w:pPr>
-              <w:spacing w:before="0" w:after="0" w:line="240" w:lineRule="auto"/>
-            </w:pPr>
-            <w:r>
-              <w:rPr>
-                <w:rFonts w:ascii="Calibri" w:hAnsi="Calibri"/>
-                <w:b w:val="0"/>
-                <w:sz w:val="17"/>
-              </w:rPr>
-              <w:t>Module (request) -&gt; /modules/y8s-m01/#m01-s01</w:t>
-              <w:br/>
-            </w:r>
-            <w:r>
-              <w:rPr>
-                <w:rFonts w:ascii="Calibri" w:hAnsi="Calibri"/>
-                <w:b w:val="0"/>
-                <w:sz w:val="17"/>
-              </w:rPr>
-              <w:t>Theory (request) -&gt; /theory.html#theory-m01-s01-data-sources</w:t>
-              <w:br/>
-            </w:r>
-            <w:r>
-              <w:rPr>
-                <w:rFonts w:ascii="Calibri" w:hAnsi="Calibri"/>
-                <w:b w:val="0"/>
-                <w:sz w:val="17"/>
-              </w:rPr>
-              <w:t>Check (request) -&gt; /theory.html#check-m01-s01</w:t>
-              <w:br/>
-            </w:r>
-            <w:r>
-              <w:rPr>
-                <w:rFonts w:ascii="Calibri" w:hAnsi="Calibri"/>
-                <w:b w:val="0"/>
-                <w:sz w:val="17"/>
-              </w:rPr>
-              <w:t>Response (request) -&gt; /theory.html#response-m01-s01</w:t>
-              <w:br/>
-            </w:r>
-            <w:r>
-              <w:rPr>
-                <w:rFonts w:ascii="Calibri" w:hAnsi="Calibri"/>
-                <w:b w:val="0"/>
-                <w:sz w:val="17"/>
-              </w:rPr>
-              <w:t>Busy Work (request) -&gt; /busy-work/#bw-m01-s01</w:t>
-              <w:br/>
-            </w:r>
-            <w:r>
-              <w:rPr>
-                <w:rFonts w:ascii="Calibri" w:hAnsi="Calibri"/>
-                <w:b w:val="0"/>
-                <w:sz w:val="17"/>
-              </w:rPr>
-              <w:t>Video (request) -&gt; /youtube-learning/#video-m01-s01</w:t>
-              <w:br/>
-            </w:r>
-            <w:r>
-              <w:rPr>
-                <w:rFonts w:ascii="Calibri" w:hAnsi="Calibri"/>
-                <w:b w:val="0"/>
-                <w:sz w:val="17"/>
-              </w:rPr>
-              <w:t>Folio (blocked) -&gt; /folio/#record-m01-s01</w:t>
-            </w:r>
-          </w:p>
-        </w:tc>
       </w:tr>
       <w:tr>
         <w:trPr>
@@ -646,85 +539,6 @@
                 <w:sz w:val="17"/>
               </w:rPr>
               <w:t>Access: chunking, read-aloud, vocabulary/reduced-copy and keyboard/print-PDF options as required.</w:t>
-            </w:r>
-          </w:p>
-        </w:tc>
-        <w:tc>
-          <w:tcPr>
-            <w:tcW w:type="dxa" w:w="2698"/>
-            <w:tcMar>
-              <w:top w:w="60" w:type="dxa"/>
-              <w:start w:w="90" w:type="dxa"/>
-              <w:bottom w:w="60" w:type="dxa"/>
-              <w:end w:w="90" w:type="dxa"/>
-            </w:tcMar>
-            <w:vAlign w:val="center"/>
-          </w:tcPr>
-          <w:p>
-            <w:pPr>
-              <w:spacing w:before="0" w:after="0" w:line="240" w:lineRule="auto"/>
-            </w:pPr>
-            <w:r>
-              <w:rPr>
-                <w:rFonts w:ascii="Calibri" w:hAnsi="Calibri"/>
-                <w:b w:val="0"/>
-                <w:sz w:val="17"/>
-              </w:rPr>
-              <w:t>Module (request) -&gt; /modules/y8s-m01/#m01-s02</w:t>
-              <w:br/>
-            </w:r>
-            <w:r>
-              <w:rPr>
-                <w:rFonts w:ascii="Calibri" w:hAnsi="Calibri"/>
-                <w:b w:val="0"/>
-                <w:sz w:val="17"/>
-              </w:rPr>
-              <w:t>Theory (request) -&gt; /theory.html#theory-m01-s02-scientific-questions</w:t>
-              <w:br/>
-            </w:r>
-            <w:r>
-              <w:rPr>
-                <w:rFonts w:ascii="Calibri" w:hAnsi="Calibri"/>
-                <w:b w:val="0"/>
-                <w:sz w:val="17"/>
-              </w:rPr>
-              <w:t>Check (request) -&gt; /theory.html#check-m01-s02</w:t>
-              <w:br/>
-            </w:r>
-            <w:r>
-              <w:rPr>
-                <w:rFonts w:ascii="Calibri" w:hAnsi="Calibri"/>
-                <w:b w:val="0"/>
-                <w:sz w:val="17"/>
-              </w:rPr>
-              <w:t>Response (request) -&gt; /theory.html#response-m01-s02</w:t>
-              <w:br/>
-            </w:r>
-            <w:r>
-              <w:rPr>
-                <w:rFonts w:ascii="Calibri" w:hAnsi="Calibri"/>
-                <w:b w:val="0"/>
-                <w:sz w:val="17"/>
-              </w:rPr>
-              <w:t>Busy Work (request) -&gt; /busy-work/#bw-m01-s02</w:t>
-              <w:br/>
-            </w:r>
-            <w:r>
-              <w:rPr>
-                <w:rFonts w:ascii="Calibri" w:hAnsi="Calibri"/>
-                <w:b w:val="0"/>
-                <w:sz w:val="17"/>
-              </w:rPr>
-              <w:t>Video (request) -&gt; /youtube-learning/#video-m01-s02</w:t>
-              <w:br/>
-            </w:r>
-            <w:r>
-              <w:rPr>
-                <w:rFonts w:ascii="Calibri" w:hAnsi="Calibri"/>
-                <w:b w:val="0"/>
-                <w:sz w:val="17"/>
-              </w:rPr>
-              <w:t>Folio (blocked) -&gt; /folio/#record-m01-s02</w:t>
             </w:r>
           </w:p>
         </w:tc>
@@ -905,85 +719,6 @@
             </w:r>
           </w:p>
         </w:tc>
-        <w:tc>
-          <w:tcPr>
-            <w:tcW w:type="dxa" w:w="2698"/>
-            <w:tcMar>
-              <w:top w:w="60" w:type="dxa"/>
-              <w:start w:w="90" w:type="dxa"/>
-              <w:bottom w:w="60" w:type="dxa"/>
-              <w:end w:w="90" w:type="dxa"/>
-            </w:tcMar>
-            <w:vAlign w:val="center"/>
-          </w:tcPr>
-          <w:p>
-            <w:pPr>
-              <w:spacing w:before="0" w:after="0" w:line="240" w:lineRule="auto"/>
-            </w:pPr>
-            <w:r>
-              <w:rPr>
-                <w:rFonts w:ascii="Calibri" w:hAnsi="Calibri"/>
-                <w:b w:val="0"/>
-                <w:sz w:val="17"/>
-              </w:rPr>
-              <w:t>Module (request) -&gt; /modules/y8s-m01/#m01-s03</w:t>
-              <w:br/>
-            </w:r>
-            <w:r>
-              <w:rPr>
-                <w:rFonts w:ascii="Calibri" w:hAnsi="Calibri"/>
-                <w:b w:val="0"/>
-                <w:sz w:val="17"/>
-              </w:rPr>
-              <w:t>Theory (request) -&gt; /theory.html#theory-m01-s03-representing-data</w:t>
-              <w:br/>
-            </w:r>
-            <w:r>
-              <w:rPr>
-                <w:rFonts w:ascii="Calibri" w:hAnsi="Calibri"/>
-                <w:b w:val="0"/>
-                <w:sz w:val="17"/>
-              </w:rPr>
-              <w:t>Check (request) -&gt; /theory.html#check-m01-s03</w:t>
-              <w:br/>
-            </w:r>
-            <w:r>
-              <w:rPr>
-                <w:rFonts w:ascii="Calibri" w:hAnsi="Calibri"/>
-                <w:b w:val="0"/>
-                <w:sz w:val="17"/>
-              </w:rPr>
-              <w:t>Response (request) -&gt; /theory.html#response-m01-s03</w:t>
-              <w:br/>
-            </w:r>
-            <w:r>
-              <w:rPr>
-                <w:rFonts w:ascii="Calibri" w:hAnsi="Calibri"/>
-                <w:b w:val="0"/>
-                <w:sz w:val="17"/>
-              </w:rPr>
-              <w:t>Busy Work (request) -&gt; /busy-work/#bw-m01-s03</w:t>
-              <w:br/>
-            </w:r>
-            <w:r>
-              <w:rPr>
-                <w:rFonts w:ascii="Calibri" w:hAnsi="Calibri"/>
-                <w:b w:val="0"/>
-                <w:sz w:val="17"/>
-              </w:rPr>
-              <w:t>Video (request) -&gt; /youtube-learning/#video-m01-s03</w:t>
-              <w:br/>
-            </w:r>
-            <w:r>
-              <w:rPr>
-                <w:rFonts w:ascii="Calibri" w:hAnsi="Calibri"/>
-                <w:b w:val="0"/>
-                <w:sz w:val="17"/>
-              </w:rPr>
-              <w:t>Folio (blocked) -&gt; /folio/#record-m01-s03</w:t>
-            </w:r>
-          </w:p>
-        </w:tc>
       </w:tr>
     </w:tbl>
     <w:p>
@@ -1014,7 +749,6 @@
         <w:gridCol w:w="3000"/>
         <w:gridCol w:w="1800"/>
         <w:gridCol w:w="5200"/>
-        <w:gridCol w:w="2698"/>
       </w:tblGrid>
       <w:tr>
         <w:trPr>
@@ -1126,33 +860,6 @@
                 <w:sz w:val="17"/>
               </w:rPr>
               <w:t>Teaching-learning / evidence summary</w:t>
-            </w:r>
-          </w:p>
-        </w:tc>
-        <w:tc>
-          <w:tcPr>
-            <w:tcW w:type="dxa" w:w="2698"/>
-            <w:shd w:fill="E8EEF5"/>
-            <w:tcMar>
-              <w:top w:w="60" w:type="dxa"/>
-              <w:start w:w="90" w:type="dxa"/>
-              <w:bottom w:w="60" w:type="dxa"/>
-              <w:end w:w="90" w:type="dxa"/>
-            </w:tcMar>
-            <w:vAlign w:val="center"/>
-          </w:tcPr>
-          <w:p>
-            <w:pPr>
-              <w:spacing w:before="0" w:after="0" w:line="240" w:lineRule="auto"/>
-            </w:pPr>
-            <w:r>
-              <w:rPr>
-                <w:rFonts w:ascii="Calibri" w:hAnsi="Calibri"/>
-                <w:b/>
-                <w:color w:val="1F4D78"/>
-                <w:sz w:val="17"/>
-              </w:rPr>
-              <w:t>Website pathway</w:t>
             </w:r>
           </w:p>
         </w:tc>
@@ -1342,85 +1049,6 @@
             </w:r>
           </w:p>
         </w:tc>
-        <w:tc>
-          <w:tcPr>
-            <w:tcW w:type="dxa" w:w="2698"/>
-            <w:tcMar>
-              <w:top w:w="60" w:type="dxa"/>
-              <w:start w:w="90" w:type="dxa"/>
-              <w:bottom w:w="60" w:type="dxa"/>
-              <w:end w:w="90" w:type="dxa"/>
-            </w:tcMar>
-            <w:vAlign w:val="center"/>
-          </w:tcPr>
-          <w:p>
-            <w:pPr>
-              <w:spacing w:before="0" w:after="0" w:line="240" w:lineRule="auto"/>
-            </w:pPr>
-            <w:r>
-              <w:rPr>
-                <w:rFonts w:ascii="Calibri" w:hAnsi="Calibri"/>
-                <w:b w:val="0"/>
-                <w:sz w:val="17"/>
-              </w:rPr>
-              <w:t>Module (request) -&gt; /modules/y8s-m02/#m02-s01</w:t>
-              <w:br/>
-            </w:r>
-            <w:r>
-              <w:rPr>
-                <w:rFonts w:ascii="Calibri" w:hAnsi="Calibri"/>
-                <w:b w:val="0"/>
-                <w:sz w:val="17"/>
-              </w:rPr>
-              <w:t>Theory (request) -&gt; /theory.html#theory-m02-s01-levels-of-organisation</w:t>
-              <w:br/>
-            </w:r>
-            <w:r>
-              <w:rPr>
-                <w:rFonts w:ascii="Calibri" w:hAnsi="Calibri"/>
-                <w:b w:val="0"/>
-                <w:sz w:val="17"/>
-              </w:rPr>
-              <w:t>Check (request) -&gt; /theory.html#check-m02-s01</w:t>
-              <w:br/>
-            </w:r>
-            <w:r>
-              <w:rPr>
-                <w:rFonts w:ascii="Calibri" w:hAnsi="Calibri"/>
-                <w:b w:val="0"/>
-                <w:sz w:val="17"/>
-              </w:rPr>
-              <w:t>Response (request) -&gt; /theory.html#response-m02-s01</w:t>
-              <w:br/>
-            </w:r>
-            <w:r>
-              <w:rPr>
-                <w:rFonts w:ascii="Calibri" w:hAnsi="Calibri"/>
-                <w:b w:val="0"/>
-                <w:sz w:val="17"/>
-              </w:rPr>
-              <w:t>Busy Work (request) -&gt; /busy-work/#bw-m02-s01</w:t>
-              <w:br/>
-            </w:r>
-            <w:r>
-              <w:rPr>
-                <w:rFonts w:ascii="Calibri" w:hAnsi="Calibri"/>
-                <w:b w:val="0"/>
-                <w:sz w:val="17"/>
-              </w:rPr>
-              <w:t>Video (request) -&gt; /youtube-learning/#video-m02-s01</w:t>
-              <w:br/>
-            </w:r>
-            <w:r>
-              <w:rPr>
-                <w:rFonts w:ascii="Calibri" w:hAnsi="Calibri"/>
-                <w:b w:val="0"/>
-                <w:sz w:val="17"/>
-              </w:rPr>
-              <w:t>Folio (blocked) -&gt; /folio/#record-m02-s01</w:t>
-            </w:r>
-          </w:p>
-        </w:tc>
       </w:tr>
       <w:tr>
         <w:trPr>
@@ -1604,85 +1232,6 @@
                 <w:sz w:val="17"/>
               </w:rPr>
               <w:t>Access: chunking, read-aloud, vocabulary/reduced-copy and keyboard/print-PDF options as required.</w:t>
-            </w:r>
-          </w:p>
-        </w:tc>
-        <w:tc>
-          <w:tcPr>
-            <w:tcW w:type="dxa" w:w="2698"/>
-            <w:tcMar>
-              <w:top w:w="60" w:type="dxa"/>
-              <w:start w:w="90" w:type="dxa"/>
-              <w:bottom w:w="60" w:type="dxa"/>
-              <w:end w:w="90" w:type="dxa"/>
-            </w:tcMar>
-            <w:vAlign w:val="center"/>
-          </w:tcPr>
-          <w:p>
-            <w:pPr>
-              <w:spacing w:before="0" w:after="0" w:line="240" w:lineRule="auto"/>
-            </w:pPr>
-            <w:r>
-              <w:rPr>
-                <w:rFonts w:ascii="Calibri" w:hAnsi="Calibri"/>
-                <w:b w:val="0"/>
-                <w:sz w:val="17"/>
-              </w:rPr>
-              <w:t>Module (request) -&gt; /modules/y8s-m02/#m02-s02</w:t>
-              <w:br/>
-            </w:r>
-            <w:r>
-              <w:rPr>
-                <w:rFonts w:ascii="Calibri" w:hAnsi="Calibri"/>
-                <w:b w:val="0"/>
-                <w:sz w:val="17"/>
-              </w:rPr>
-              <w:t>Theory (request) -&gt; /theory.html#theory-m02-s02-plant-organs</w:t>
-              <w:br/>
-            </w:r>
-            <w:r>
-              <w:rPr>
-                <w:rFonts w:ascii="Calibri" w:hAnsi="Calibri"/>
-                <w:b w:val="0"/>
-                <w:sz w:val="17"/>
-              </w:rPr>
-              <w:t>Check (request) -&gt; /theory.html#check-m02-s02</w:t>
-              <w:br/>
-            </w:r>
-            <w:r>
-              <w:rPr>
-                <w:rFonts w:ascii="Calibri" w:hAnsi="Calibri"/>
-                <w:b w:val="0"/>
-                <w:sz w:val="17"/>
-              </w:rPr>
-              <w:t>Response (request) -&gt; /theory.html#response-m02-s02</w:t>
-              <w:br/>
-            </w:r>
-            <w:r>
-              <w:rPr>
-                <w:rFonts w:ascii="Calibri" w:hAnsi="Calibri"/>
-                <w:b w:val="0"/>
-                <w:sz w:val="17"/>
-              </w:rPr>
-              <w:t>Busy Work (request) -&gt; /busy-work/#bw-m02-s02</w:t>
-              <w:br/>
-            </w:r>
-            <w:r>
-              <w:rPr>
-                <w:rFonts w:ascii="Calibri" w:hAnsi="Calibri"/>
-                <w:b w:val="0"/>
-                <w:sz w:val="17"/>
-              </w:rPr>
-              <w:t>Video (request) -&gt; /youtube-learning/#video-m02-s02</w:t>
-              <w:br/>
-            </w:r>
-            <w:r>
-              <w:rPr>
-                <w:rFonts w:ascii="Calibri" w:hAnsi="Calibri"/>
-                <w:b w:val="0"/>
-                <w:sz w:val="17"/>
-              </w:rPr>
-              <w:t>Folio (blocked) -&gt; /folio/#record-m02-s02</w:t>
             </w:r>
           </w:p>
         </w:tc>
@@ -1872,85 +1421,6 @@
             </w:r>
           </w:p>
         </w:tc>
-        <w:tc>
-          <w:tcPr>
-            <w:tcW w:type="dxa" w:w="2698"/>
-            <w:tcMar>
-              <w:top w:w="60" w:type="dxa"/>
-              <w:start w:w="90" w:type="dxa"/>
-              <w:bottom w:w="60" w:type="dxa"/>
-              <w:end w:w="90" w:type="dxa"/>
-            </w:tcMar>
-            <w:vAlign w:val="center"/>
-          </w:tcPr>
-          <w:p>
-            <w:pPr>
-              <w:spacing w:before="0" w:after="0" w:line="240" w:lineRule="auto"/>
-            </w:pPr>
-            <w:r>
-              <w:rPr>
-                <w:rFonts w:ascii="Calibri" w:hAnsi="Calibri"/>
-                <w:b w:val="0"/>
-                <w:sz w:val="17"/>
-              </w:rPr>
-              <w:t>Module (request) -&gt; /modules/y8s-m02/#m02-s03</w:t>
-              <w:br/>
-            </w:r>
-            <w:r>
-              <w:rPr>
-                <w:rFonts w:ascii="Calibri" w:hAnsi="Calibri"/>
-                <w:b w:val="0"/>
-                <w:sz w:val="17"/>
-              </w:rPr>
-              <w:t>Theory (request) -&gt; /theory.html#theory-m02-s03-ecosystem-relationships</w:t>
-              <w:br/>
-            </w:r>
-            <w:r>
-              <w:rPr>
-                <w:rFonts w:ascii="Calibri" w:hAnsi="Calibri"/>
-                <w:b w:val="0"/>
-                <w:sz w:val="17"/>
-              </w:rPr>
-              <w:t>Check (request) -&gt; /theory.html#check-m02-s03</w:t>
-              <w:br/>
-            </w:r>
-            <w:r>
-              <w:rPr>
-                <w:rFonts w:ascii="Calibri" w:hAnsi="Calibri"/>
-                <w:b w:val="0"/>
-                <w:sz w:val="17"/>
-              </w:rPr>
-              <w:t>Response (request) -&gt; /theory.html#response-m02-s03</w:t>
-              <w:br/>
-            </w:r>
-            <w:r>
-              <w:rPr>
-                <w:rFonts w:ascii="Calibri" w:hAnsi="Calibri"/>
-                <w:b w:val="0"/>
-                <w:sz w:val="17"/>
-              </w:rPr>
-              <w:t>Busy Work (request) -&gt; /busy-work/#bw-m02-s03</w:t>
-              <w:br/>
-            </w:r>
-            <w:r>
-              <w:rPr>
-                <w:rFonts w:ascii="Calibri" w:hAnsi="Calibri"/>
-                <w:b w:val="0"/>
-                <w:sz w:val="17"/>
-              </w:rPr>
-              <w:t>Video (request) -&gt; /youtube-learning/#video-m02-s03</w:t>
-              <w:br/>
-            </w:r>
-            <w:r>
-              <w:rPr>
-                <w:rFonts w:ascii="Calibri" w:hAnsi="Calibri"/>
-                <w:b w:val="0"/>
-                <w:sz w:val="17"/>
-              </w:rPr>
-              <w:t>Folio (blocked) -&gt; /folio/#record-m02-s03</w:t>
-            </w:r>
-          </w:p>
-        </w:tc>
       </w:tr>
     </w:tbl>
     <w:p>
@@ -1981,7 +1451,6 @@
         <w:gridCol w:w="3000"/>
         <w:gridCol w:w="1800"/>
         <w:gridCol w:w="5200"/>
-        <w:gridCol w:w="2698"/>
       </w:tblGrid>
       <w:tr>
         <w:trPr>
@@ -2093,33 +1562,6 @@
                 <w:sz w:val="17"/>
               </w:rPr>
               <w:t>Teaching-learning / evidence summary</w:t>
-            </w:r>
-          </w:p>
-        </w:tc>
-        <w:tc>
-          <w:tcPr>
-            <w:tcW w:type="dxa" w:w="2698"/>
-            <w:shd w:fill="E8EEF5"/>
-            <w:tcMar>
-              <w:top w:w="60" w:type="dxa"/>
-              <w:start w:w="90" w:type="dxa"/>
-              <w:bottom w:w="60" w:type="dxa"/>
-              <w:end w:w="90" w:type="dxa"/>
-            </w:tcMar>
-            <w:vAlign w:val="center"/>
-          </w:tcPr>
-          <w:p>
-            <w:pPr>
-              <w:spacing w:before="0" w:after="0" w:line="240" w:lineRule="auto"/>
-            </w:pPr>
-            <w:r>
-              <w:rPr>
-                <w:rFonts w:ascii="Calibri" w:hAnsi="Calibri"/>
-                <w:b/>
-                <w:color w:val="1F4D78"/>
-                <w:sz w:val="17"/>
-              </w:rPr>
-              <w:t>Website pathway</w:t>
             </w:r>
           </w:p>
         </w:tc>
@@ -2300,85 +1742,6 @@
             </w:r>
           </w:p>
         </w:tc>
-        <w:tc>
-          <w:tcPr>
-            <w:tcW w:type="dxa" w:w="2698"/>
-            <w:tcMar>
-              <w:top w:w="60" w:type="dxa"/>
-              <w:start w:w="90" w:type="dxa"/>
-              <w:bottom w:w="60" w:type="dxa"/>
-              <w:end w:w="90" w:type="dxa"/>
-            </w:tcMar>
-            <w:vAlign w:val="center"/>
-          </w:tcPr>
-          <w:p>
-            <w:pPr>
-              <w:spacing w:before="0" w:after="0" w:line="240" w:lineRule="auto"/>
-            </w:pPr>
-            <w:r>
-              <w:rPr>
-                <w:rFonts w:ascii="Calibri" w:hAnsi="Calibri"/>
-                <w:b w:val="0"/>
-                <w:sz w:val="17"/>
-              </w:rPr>
-              <w:t>Module (request) -&gt; /modules/y8s-m03/#m03-s01</w:t>
-              <w:br/>
-            </w:r>
-            <w:r>
-              <w:rPr>
-                <w:rFonts w:ascii="Calibri" w:hAnsi="Calibri"/>
-                <w:b w:val="0"/>
-                <w:sz w:val="17"/>
-              </w:rPr>
-              <w:t>Theory (request) -&gt; /theory.html#theory-m03-s01-classifying-matter</w:t>
-              <w:br/>
-            </w:r>
-            <w:r>
-              <w:rPr>
-                <w:rFonts w:ascii="Calibri" w:hAnsi="Calibri"/>
-                <w:b w:val="0"/>
-                <w:sz w:val="17"/>
-              </w:rPr>
-              <w:t>Check (request) -&gt; /theory.html#check-m03-s01</w:t>
-              <w:br/>
-            </w:r>
-            <w:r>
-              <w:rPr>
-                <w:rFonts w:ascii="Calibri" w:hAnsi="Calibri"/>
-                <w:b w:val="0"/>
-                <w:sz w:val="17"/>
-              </w:rPr>
-              <w:t>Response (request) -&gt; /theory.html#response-m03-s01</w:t>
-              <w:br/>
-            </w:r>
-            <w:r>
-              <w:rPr>
-                <w:rFonts w:ascii="Calibri" w:hAnsi="Calibri"/>
-                <w:b w:val="0"/>
-                <w:sz w:val="17"/>
-              </w:rPr>
-              <w:t>Busy Work (request) -&gt; /busy-work/#bw-m03-s01</w:t>
-              <w:br/>
-            </w:r>
-            <w:r>
-              <w:rPr>
-                <w:rFonts w:ascii="Calibri" w:hAnsi="Calibri"/>
-                <w:b w:val="0"/>
-                <w:sz w:val="17"/>
-              </w:rPr>
-              <w:t>Video (request) -&gt; /youtube-learning/#video-m03-s01</w:t>
-              <w:br/>
-            </w:r>
-            <w:r>
-              <w:rPr>
-                <w:rFonts w:ascii="Calibri" w:hAnsi="Calibri"/>
-                <w:b w:val="0"/>
-                <w:sz w:val="17"/>
-              </w:rPr>
-              <w:t>Folio (blocked) -&gt; /folio/#record-m03-s01</w:t>
-            </w:r>
-          </w:p>
-        </w:tc>
       </w:tr>
       <w:tr>
         <w:trPr>
@@ -2553,85 +1916,6 @@
                 <w:sz w:val="17"/>
               </w:rPr>
               <w:t>Access: chunking, read-aloud, vocabulary/reduced-copy and keyboard/print-PDF options as required.</w:t>
-            </w:r>
-          </w:p>
-        </w:tc>
-        <w:tc>
-          <w:tcPr>
-            <w:tcW w:type="dxa" w:w="2698"/>
-            <w:tcMar>
-              <w:top w:w="60" w:type="dxa"/>
-              <w:start w:w="90" w:type="dxa"/>
-              <w:bottom w:w="60" w:type="dxa"/>
-              <w:end w:w="90" w:type="dxa"/>
-            </w:tcMar>
-            <w:vAlign w:val="center"/>
-          </w:tcPr>
-          <w:p>
-            <w:pPr>
-              <w:spacing w:before="0" w:after="0" w:line="240" w:lineRule="auto"/>
-            </w:pPr>
-            <w:r>
-              <w:rPr>
-                <w:rFonts w:ascii="Calibri" w:hAnsi="Calibri"/>
-                <w:b w:val="0"/>
-                <w:sz w:val="17"/>
-              </w:rPr>
-              <w:t>Module (request) -&gt; /modules/y8s-m03/#m03-s02</w:t>
-              <w:br/>
-            </w:r>
-            <w:r>
-              <w:rPr>
-                <w:rFonts w:ascii="Calibri" w:hAnsi="Calibri"/>
-                <w:b w:val="0"/>
-                <w:sz w:val="17"/>
-              </w:rPr>
-              <w:t>Theory (request) -&gt; /theory.html#theory-m03-s02-atomic-structure</w:t>
-              <w:br/>
-            </w:r>
-            <w:r>
-              <w:rPr>
-                <w:rFonts w:ascii="Calibri" w:hAnsi="Calibri"/>
-                <w:b w:val="0"/>
-                <w:sz w:val="17"/>
-              </w:rPr>
-              <w:t>Check (request) -&gt; /theory.html#check-m03-s02</w:t>
-              <w:br/>
-            </w:r>
-            <w:r>
-              <w:rPr>
-                <w:rFonts w:ascii="Calibri" w:hAnsi="Calibri"/>
-                <w:b w:val="0"/>
-                <w:sz w:val="17"/>
-              </w:rPr>
-              <w:t>Response (request) -&gt; /theory.html#response-m03-s02</w:t>
-              <w:br/>
-            </w:r>
-            <w:r>
-              <w:rPr>
-                <w:rFonts w:ascii="Calibri" w:hAnsi="Calibri"/>
-                <w:b w:val="0"/>
-                <w:sz w:val="17"/>
-              </w:rPr>
-              <w:t>Busy Work (request) -&gt; /busy-work/#bw-m03-s02</w:t>
-              <w:br/>
-            </w:r>
-            <w:r>
-              <w:rPr>
-                <w:rFonts w:ascii="Calibri" w:hAnsi="Calibri"/>
-                <w:b w:val="0"/>
-                <w:sz w:val="17"/>
-              </w:rPr>
-              <w:t>Video (request) -&gt; /youtube-learning/#video-m03-s02</w:t>
-              <w:br/>
-            </w:r>
-            <w:r>
-              <w:rPr>
-                <w:rFonts w:ascii="Calibri" w:hAnsi="Calibri"/>
-                <w:b w:val="0"/>
-                <w:sz w:val="17"/>
-              </w:rPr>
-              <w:t>Folio (blocked) -&gt; /folio/#record-m03-s02</w:t>
             </w:r>
           </w:p>
         </w:tc>
@@ -2812,85 +2096,6 @@
             </w:r>
           </w:p>
         </w:tc>
-        <w:tc>
-          <w:tcPr>
-            <w:tcW w:type="dxa" w:w="2698"/>
-            <w:tcMar>
-              <w:top w:w="60" w:type="dxa"/>
-              <w:start w:w="90" w:type="dxa"/>
-              <w:bottom w:w="60" w:type="dxa"/>
-              <w:end w:w="90" w:type="dxa"/>
-            </w:tcMar>
-            <w:vAlign w:val="center"/>
-          </w:tcPr>
-          <w:p>
-            <w:pPr>
-              <w:spacing w:before="0" w:after="0" w:line="240" w:lineRule="auto"/>
-            </w:pPr>
-            <w:r>
-              <w:rPr>
-                <w:rFonts w:ascii="Calibri" w:hAnsi="Calibri"/>
-                <w:b w:val="0"/>
-                <w:sz w:val="17"/>
-              </w:rPr>
-              <w:t>Module (request) -&gt; /modules/y8s-m03/#m03-s03</w:t>
-              <w:br/>
-            </w:r>
-            <w:r>
-              <w:rPr>
-                <w:rFonts w:ascii="Calibri" w:hAnsi="Calibri"/>
-                <w:b w:val="0"/>
-                <w:sz w:val="17"/>
-              </w:rPr>
-              <w:t>Theory (request) -&gt; /theory.html#theory-m03-s03-symbols-and-atomic-number</w:t>
-              <w:br/>
-            </w:r>
-            <w:r>
-              <w:rPr>
-                <w:rFonts w:ascii="Calibri" w:hAnsi="Calibri"/>
-                <w:b w:val="0"/>
-                <w:sz w:val="17"/>
-              </w:rPr>
-              <w:t>Check (request) -&gt; /theory.html#check-m03-s03</w:t>
-              <w:br/>
-            </w:r>
-            <w:r>
-              <w:rPr>
-                <w:rFonts w:ascii="Calibri" w:hAnsi="Calibri"/>
-                <w:b w:val="0"/>
-                <w:sz w:val="17"/>
-              </w:rPr>
-              <w:t>Response (request) -&gt; /theory.html#response-m03-s03</w:t>
-              <w:br/>
-            </w:r>
-            <w:r>
-              <w:rPr>
-                <w:rFonts w:ascii="Calibri" w:hAnsi="Calibri"/>
-                <w:b w:val="0"/>
-                <w:sz w:val="17"/>
-              </w:rPr>
-              <w:t>Busy Work (request) -&gt; /busy-work/#bw-m03-s03</w:t>
-              <w:br/>
-            </w:r>
-            <w:r>
-              <w:rPr>
-                <w:rFonts w:ascii="Calibri" w:hAnsi="Calibri"/>
-                <w:b w:val="0"/>
-                <w:sz w:val="17"/>
-              </w:rPr>
-              <w:t>Video (request) -&gt; /youtube-learning/#video-m03-s03</w:t>
-              <w:br/>
-            </w:r>
-            <w:r>
-              <w:rPr>
-                <w:rFonts w:ascii="Calibri" w:hAnsi="Calibri"/>
-                <w:b w:val="0"/>
-                <w:sz w:val="17"/>
-              </w:rPr>
-              <w:t>Folio (blocked) -&gt; /folio/#record-m03-s03</w:t>
-            </w:r>
-          </w:p>
-        </w:tc>
       </w:tr>
     </w:tbl>
     <w:p>
@@ -2921,7 +2126,6 @@
         <w:gridCol w:w="3000"/>
         <w:gridCol w:w="1800"/>
         <w:gridCol w:w="5200"/>
-        <w:gridCol w:w="2698"/>
       </w:tblGrid>
       <w:tr>
         <w:trPr>
@@ -3033,33 +2237,6 @@
                 <w:sz w:val="17"/>
               </w:rPr>
               <w:t>Teaching-learning / evidence summary</w:t>
-            </w:r>
-          </w:p>
-        </w:tc>
-        <w:tc>
-          <w:tcPr>
-            <w:tcW w:type="dxa" w:w="2698"/>
-            <w:shd w:fill="E8EEF5"/>
-            <w:tcMar>
-              <w:top w:w="60" w:type="dxa"/>
-              <w:start w:w="90" w:type="dxa"/>
-              <w:bottom w:w="60" w:type="dxa"/>
-              <w:end w:w="90" w:type="dxa"/>
-            </w:tcMar>
-            <w:vAlign w:val="center"/>
-          </w:tcPr>
-          <w:p>
-            <w:pPr>
-              <w:spacing w:before="0" w:after="0" w:line="240" w:lineRule="auto"/>
-            </w:pPr>
-            <w:r>
-              <w:rPr>
-                <w:rFonts w:ascii="Calibri" w:hAnsi="Calibri"/>
-                <w:b/>
-                <w:color w:val="1F4D78"/>
-                <w:sz w:val="17"/>
-              </w:rPr>
-              <w:t>Website pathway</w:t>
             </w:r>
           </w:p>
         </w:tc>
@@ -3249,85 +2426,6 @@
             </w:r>
           </w:p>
         </w:tc>
-        <w:tc>
-          <w:tcPr>
-            <w:tcW w:type="dxa" w:w="2698"/>
-            <w:tcMar>
-              <w:top w:w="60" w:type="dxa"/>
-              <w:start w:w="90" w:type="dxa"/>
-              <w:bottom w:w="60" w:type="dxa"/>
-              <w:end w:w="90" w:type="dxa"/>
-            </w:tcMar>
-            <w:vAlign w:val="center"/>
-          </w:tcPr>
-          <w:p>
-            <w:pPr>
-              <w:spacing w:before="0" w:after="0" w:line="240" w:lineRule="auto"/>
-            </w:pPr>
-            <w:r>
-              <w:rPr>
-                <w:rFonts w:ascii="Calibri" w:hAnsi="Calibri"/>
-                <w:b w:val="0"/>
-                <w:sz w:val="17"/>
-              </w:rPr>
-              <w:t>Module (request) -&gt; /modules/y8s-m04/#m04-s01</w:t>
-              <w:br/>
-            </w:r>
-            <w:r>
-              <w:rPr>
-                <w:rFonts w:ascii="Calibri" w:hAnsi="Calibri"/>
-                <w:b w:val="0"/>
-                <w:sz w:val="17"/>
-              </w:rPr>
-              <w:t>Theory (request) -&gt; /theory.html#theory-m04-s01-systems-and-stores</w:t>
-              <w:br/>
-            </w:r>
-            <w:r>
-              <w:rPr>
-                <w:rFonts w:ascii="Calibri" w:hAnsi="Calibri"/>
-                <w:b w:val="0"/>
-                <w:sz w:val="17"/>
-              </w:rPr>
-              <w:t>Check (request) -&gt; /theory.html#check-m04-s01</w:t>
-              <w:br/>
-            </w:r>
-            <w:r>
-              <w:rPr>
-                <w:rFonts w:ascii="Calibri" w:hAnsi="Calibri"/>
-                <w:b w:val="0"/>
-                <w:sz w:val="17"/>
-              </w:rPr>
-              <w:t>Response (request) -&gt; /theory.html#response-m04-s01</w:t>
-              <w:br/>
-            </w:r>
-            <w:r>
-              <w:rPr>
-                <w:rFonts w:ascii="Calibri" w:hAnsi="Calibri"/>
-                <w:b w:val="0"/>
-                <w:sz w:val="17"/>
-              </w:rPr>
-              <w:t>Busy Work (request) -&gt; /busy-work/#bw-m04-s01</w:t>
-              <w:br/>
-            </w:r>
-            <w:r>
-              <w:rPr>
-                <w:rFonts w:ascii="Calibri" w:hAnsi="Calibri"/>
-                <w:b w:val="0"/>
-                <w:sz w:val="17"/>
-              </w:rPr>
-              <w:t>Video (request) -&gt; /youtube-learning/#video-m04-s01</w:t>
-              <w:br/>
-            </w:r>
-            <w:r>
-              <w:rPr>
-                <w:rFonts w:ascii="Calibri" w:hAnsi="Calibri"/>
-                <w:b w:val="0"/>
-                <w:sz w:val="17"/>
-              </w:rPr>
-              <w:t>Folio (blocked) -&gt; /folio/#record-m04-s01</w:t>
-            </w:r>
-          </w:p>
-        </w:tc>
       </w:tr>
       <w:tr>
         <w:trPr>
@@ -3511,85 +2609,6 @@
                 <w:sz w:val="17"/>
               </w:rPr>
               <w:t>Access: chunking, read-aloud, vocabulary/reduced-copy and keyboard/print-PDF options as required.</w:t>
-            </w:r>
-          </w:p>
-        </w:tc>
-        <w:tc>
-          <w:tcPr>
-            <w:tcW w:type="dxa" w:w="2698"/>
-            <w:tcMar>
-              <w:top w:w="60" w:type="dxa"/>
-              <w:start w:w="90" w:type="dxa"/>
-              <w:bottom w:w="60" w:type="dxa"/>
-              <w:end w:w="90" w:type="dxa"/>
-            </w:tcMar>
-            <w:vAlign w:val="center"/>
-          </w:tcPr>
-          <w:p>
-            <w:pPr>
-              <w:spacing w:before="0" w:after="0" w:line="240" w:lineRule="auto"/>
-            </w:pPr>
-            <w:r>
-              <w:rPr>
-                <w:rFonts w:ascii="Calibri" w:hAnsi="Calibri"/>
-                <w:b w:val="0"/>
-                <w:sz w:val="17"/>
-              </w:rPr>
-              <w:t>Module (request) -&gt; /modules/y8s-m04/#m04-s02</w:t>
-              <w:br/>
-            </w:r>
-            <w:r>
-              <w:rPr>
-                <w:rFonts w:ascii="Calibri" w:hAnsi="Calibri"/>
-                <w:b w:val="0"/>
-                <w:sz w:val="17"/>
-              </w:rPr>
-              <w:t>Theory (request) -&gt; /theory.html#theory-m04-s02-physical-and-chemical-change</w:t>
-              <w:br/>
-            </w:r>
-            <w:r>
-              <w:rPr>
-                <w:rFonts w:ascii="Calibri" w:hAnsi="Calibri"/>
-                <w:b w:val="0"/>
-                <w:sz w:val="17"/>
-              </w:rPr>
-              <w:t>Check (request) -&gt; /theory.html#check-m04-s02</w:t>
-              <w:br/>
-            </w:r>
-            <w:r>
-              <w:rPr>
-                <w:rFonts w:ascii="Calibri" w:hAnsi="Calibri"/>
-                <w:b w:val="0"/>
-                <w:sz w:val="17"/>
-              </w:rPr>
-              <w:t>Response (request) -&gt; /theory.html#response-m04-s02</w:t>
-              <w:br/>
-            </w:r>
-            <w:r>
-              <w:rPr>
-                <w:rFonts w:ascii="Calibri" w:hAnsi="Calibri"/>
-                <w:b w:val="0"/>
-                <w:sz w:val="17"/>
-              </w:rPr>
-              <w:t>Busy Work (request) -&gt; /busy-work/#bw-m04-s02</w:t>
-              <w:br/>
-            </w:r>
-            <w:r>
-              <w:rPr>
-                <w:rFonts w:ascii="Calibri" w:hAnsi="Calibri"/>
-                <w:b w:val="0"/>
-                <w:sz w:val="17"/>
-              </w:rPr>
-              <w:t>Video (request) -&gt; /youtube-learning/#video-m04-s02</w:t>
-              <w:br/>
-            </w:r>
-            <w:r>
-              <w:rPr>
-                <w:rFonts w:ascii="Calibri" w:hAnsi="Calibri"/>
-                <w:b w:val="0"/>
-                <w:sz w:val="17"/>
-              </w:rPr>
-              <w:t>Folio (blocked) -&gt; /folio/#record-m04-s02</w:t>
             </w:r>
           </w:p>
         </w:tc>
@@ -3779,85 +2798,6 @@
             </w:r>
           </w:p>
         </w:tc>
-        <w:tc>
-          <w:tcPr>
-            <w:tcW w:type="dxa" w:w="2698"/>
-            <w:tcMar>
-              <w:top w:w="60" w:type="dxa"/>
-              <w:start w:w="90" w:type="dxa"/>
-              <w:bottom w:w="60" w:type="dxa"/>
-              <w:end w:w="90" w:type="dxa"/>
-            </w:tcMar>
-            <w:vAlign w:val="center"/>
-          </w:tcPr>
-          <w:p>
-            <w:pPr>
-              <w:spacing w:before="0" w:after="0" w:line="240" w:lineRule="auto"/>
-            </w:pPr>
-            <w:r>
-              <w:rPr>
-                <w:rFonts w:ascii="Calibri" w:hAnsi="Calibri"/>
-                <w:b w:val="0"/>
-                <w:sz w:val="17"/>
-              </w:rPr>
-              <w:t>Module (request) -&gt; /modules/y8s-m04/#m04-s03</w:t>
-              <w:br/>
-            </w:r>
-            <w:r>
-              <w:rPr>
-                <w:rFonts w:ascii="Calibri" w:hAnsi="Calibri"/>
-                <w:b w:val="0"/>
-                <w:sz w:val="17"/>
-              </w:rPr>
-              <w:t>Theory (request) -&gt; /theory.html#theory-m04-s03-geological-change-rock-cycle</w:t>
-              <w:br/>
-            </w:r>
-            <w:r>
-              <w:rPr>
-                <w:rFonts w:ascii="Calibri" w:hAnsi="Calibri"/>
-                <w:b w:val="0"/>
-                <w:sz w:val="17"/>
-              </w:rPr>
-              <w:t>Check (request) -&gt; /theory.html#check-m04-s03</w:t>
-              <w:br/>
-            </w:r>
-            <w:r>
-              <w:rPr>
-                <w:rFonts w:ascii="Calibri" w:hAnsi="Calibri"/>
-                <w:b w:val="0"/>
-                <w:sz w:val="17"/>
-              </w:rPr>
-              <w:t>Response (request) -&gt; /theory.html#response-m04-s03</w:t>
-              <w:br/>
-            </w:r>
-            <w:r>
-              <w:rPr>
-                <w:rFonts w:ascii="Calibri" w:hAnsi="Calibri"/>
-                <w:b w:val="0"/>
-                <w:sz w:val="17"/>
-              </w:rPr>
-              <w:t>Busy Work (request) -&gt; /busy-work/#bw-m04-s03</w:t>
-              <w:br/>
-            </w:r>
-            <w:r>
-              <w:rPr>
-                <w:rFonts w:ascii="Calibri" w:hAnsi="Calibri"/>
-                <w:b w:val="0"/>
-                <w:sz w:val="17"/>
-              </w:rPr>
-              <w:t>Video (request) -&gt; /youtube-learning/#video-m04-s03</w:t>
-              <w:br/>
-            </w:r>
-            <w:r>
-              <w:rPr>
-                <w:rFonts w:ascii="Calibri" w:hAnsi="Calibri"/>
-                <w:b w:val="0"/>
-                <w:sz w:val="17"/>
-              </w:rPr>
-              <w:t>Folio (blocked) -&gt; /folio/#record-m04-s03</w:t>
-            </w:r>
-          </w:p>
-        </w:tc>
       </w:tr>
     </w:tbl>
     <w:p>
@@ -3888,7 +2828,6 @@
         <w:gridCol w:w="3000"/>
         <w:gridCol w:w="1800"/>
         <w:gridCol w:w="5200"/>
-        <w:gridCol w:w="2698"/>
       </w:tblGrid>
       <w:tr>
         <w:trPr>
@@ -4000,33 +2939,6 @@
                 <w:sz w:val="17"/>
               </w:rPr>
               <w:t>Teaching-learning / evidence summary</w:t>
-            </w:r>
-          </w:p>
-        </w:tc>
-        <w:tc>
-          <w:tcPr>
-            <w:tcW w:type="dxa" w:w="2698"/>
-            <w:shd w:fill="E8EEF5"/>
-            <w:tcMar>
-              <w:top w:w="60" w:type="dxa"/>
-              <w:start w:w="90" w:type="dxa"/>
-              <w:bottom w:w="60" w:type="dxa"/>
-              <w:end w:w="90" w:type="dxa"/>
-            </w:tcMar>
-            <w:vAlign w:val="center"/>
-          </w:tcPr>
-          <w:p>
-            <w:pPr>
-              <w:spacing w:before="0" w:after="0" w:line="240" w:lineRule="auto"/>
-            </w:pPr>
-            <w:r>
-              <w:rPr>
-                <w:rFonts w:ascii="Calibri" w:hAnsi="Calibri"/>
-                <w:b/>
-                <w:color w:val="1F4D78"/>
-                <w:sz w:val="17"/>
-              </w:rPr>
-              <w:t>Website pathway</w:t>
             </w:r>
           </w:p>
         </w:tc>
@@ -4207,85 +3119,6 @@
             </w:r>
           </w:p>
         </w:tc>
-        <w:tc>
-          <w:tcPr>
-            <w:tcW w:type="dxa" w:w="2698"/>
-            <w:tcMar>
-              <w:top w:w="60" w:type="dxa"/>
-              <w:start w:w="90" w:type="dxa"/>
-              <w:bottom w:w="60" w:type="dxa"/>
-              <w:end w:w="90" w:type="dxa"/>
-            </w:tcMar>
-            <w:vAlign w:val="center"/>
-          </w:tcPr>
-          <w:p>
-            <w:pPr>
-              <w:spacing w:before="0" w:after="0" w:line="240" w:lineRule="auto"/>
-            </w:pPr>
-            <w:r>
-              <w:rPr>
-                <w:rFonts w:ascii="Calibri" w:hAnsi="Calibri"/>
-                <w:b w:val="0"/>
-                <w:sz w:val="17"/>
-              </w:rPr>
-              <w:t>Module (request) -&gt; /modules/y8s-m05/#m05-s01</w:t>
-              <w:br/>
-            </w:r>
-            <w:r>
-              <w:rPr>
-                <w:rFonts w:ascii="Calibri" w:hAnsi="Calibri"/>
-                <w:b w:val="0"/>
-                <w:sz w:val="17"/>
-              </w:rPr>
-              <w:t>Theory (request) -&gt; /theory.html#theory-m05-s01-model-purpose-components</w:t>
-              <w:br/>
-            </w:r>
-            <w:r>
-              <w:rPr>
-                <w:rFonts w:ascii="Calibri" w:hAnsi="Calibri"/>
-                <w:b w:val="0"/>
-                <w:sz w:val="17"/>
-              </w:rPr>
-              <w:t>Check (request) -&gt; /theory.html#check-m05-s01</w:t>
-              <w:br/>
-            </w:r>
-            <w:r>
-              <w:rPr>
-                <w:rFonts w:ascii="Calibri" w:hAnsi="Calibri"/>
-                <w:b w:val="0"/>
-                <w:sz w:val="17"/>
-              </w:rPr>
-              <w:t>Response (request) -&gt; /theory.html#response-m05-s01</w:t>
-              <w:br/>
-            </w:r>
-            <w:r>
-              <w:rPr>
-                <w:rFonts w:ascii="Calibri" w:hAnsi="Calibri"/>
-                <w:b w:val="0"/>
-                <w:sz w:val="17"/>
-              </w:rPr>
-              <w:t>Busy Work (request) -&gt; /busy-work/#bw-m05-s01</w:t>
-              <w:br/>
-            </w:r>
-            <w:r>
-              <w:rPr>
-                <w:rFonts w:ascii="Calibri" w:hAnsi="Calibri"/>
-                <w:b w:val="0"/>
-                <w:sz w:val="17"/>
-              </w:rPr>
-              <w:t>Video (request) -&gt; /youtube-learning/#video-m05-s01</w:t>
-              <w:br/>
-            </w:r>
-            <w:r>
-              <w:rPr>
-                <w:rFonts w:ascii="Calibri" w:hAnsi="Calibri"/>
-                <w:b w:val="0"/>
-                <w:sz w:val="17"/>
-              </w:rPr>
-              <w:t>Folio (blocked) -&gt; /folio/#record-m05-s01</w:t>
-            </w:r>
-          </w:p>
-        </w:tc>
       </w:tr>
       <w:tr>
         <w:trPr>
@@ -4463,85 +3296,6 @@
             </w:r>
           </w:p>
         </w:tc>
-        <w:tc>
-          <w:tcPr>
-            <w:tcW w:type="dxa" w:w="2698"/>
-            <w:tcMar>
-              <w:top w:w="60" w:type="dxa"/>
-              <w:start w:w="90" w:type="dxa"/>
-              <w:bottom w:w="60" w:type="dxa"/>
-              <w:end w:w="90" w:type="dxa"/>
-            </w:tcMar>
-            <w:vAlign w:val="center"/>
-          </w:tcPr>
-          <w:p>
-            <w:pPr>
-              <w:spacing w:before="0" w:after="0" w:line="240" w:lineRule="auto"/>
-            </w:pPr>
-            <w:r>
-              <w:rPr>
-                <w:rFonts w:ascii="Calibri" w:hAnsi="Calibri"/>
-                <w:b w:val="0"/>
-                <w:sz w:val="17"/>
-              </w:rPr>
-              <w:t>Module (request) -&gt; /modules/y8s-m05/#m05-s02</w:t>
-              <w:br/>
-            </w:r>
-            <w:r>
-              <w:rPr>
-                <w:rFonts w:ascii="Calibri" w:hAnsi="Calibri"/>
-                <w:b w:val="0"/>
-                <w:sz w:val="17"/>
-              </w:rPr>
-              <w:t>Theory (request) -&gt; /theory.html#theory-m05-s02-simulation-components</w:t>
-              <w:br/>
-            </w:r>
-            <w:r>
-              <w:rPr>
-                <w:rFonts w:ascii="Calibri" w:hAnsi="Calibri"/>
-                <w:b w:val="0"/>
-                <w:sz w:val="17"/>
-              </w:rPr>
-              <w:t>Check (request) -&gt; /theory.html#check-m05-s02</w:t>
-              <w:br/>
-            </w:r>
-            <w:r>
-              <w:rPr>
-                <w:rFonts w:ascii="Calibri" w:hAnsi="Calibri"/>
-                <w:b w:val="0"/>
-                <w:sz w:val="17"/>
-              </w:rPr>
-              <w:t>Response (request) -&gt; /theory.html#response-m05-s02</w:t>
-              <w:br/>
-            </w:r>
-            <w:r>
-              <w:rPr>
-                <w:rFonts w:ascii="Calibri" w:hAnsi="Calibri"/>
-                <w:b w:val="0"/>
-                <w:sz w:val="17"/>
-              </w:rPr>
-              <w:t>Busy Work (request) -&gt; /busy-work/#bw-m05-s02</w:t>
-              <w:br/>
-            </w:r>
-            <w:r>
-              <w:rPr>
-                <w:rFonts w:ascii="Calibri" w:hAnsi="Calibri"/>
-                <w:b w:val="0"/>
-                <w:sz w:val="17"/>
-              </w:rPr>
-              <w:t>Video (request) -&gt; /youtube-learning/#video-m05-s02</w:t>
-              <w:br/>
-            </w:r>
-            <w:r>
-              <w:rPr>
-                <w:rFonts w:ascii="Calibri" w:hAnsi="Calibri"/>
-                <w:b w:val="0"/>
-                <w:sz w:val="17"/>
-              </w:rPr>
-              <w:t>Folio (blocked) -&gt; /folio/#record-m05-s02</w:t>
-            </w:r>
-          </w:p>
-        </w:tc>
       </w:tr>
       <w:tr>
         <w:trPr>
@@ -4716,85 +3470,6 @@
                 <w:sz w:val="17"/>
               </w:rPr>
               <w:t>Access: chunking, read-aloud, vocabulary/reduced-copy and keyboard/print-PDF options as required.</w:t>
-            </w:r>
-          </w:p>
-        </w:tc>
-        <w:tc>
-          <w:tcPr>
-            <w:tcW w:type="dxa" w:w="2698"/>
-            <w:tcMar>
-              <w:top w:w="60" w:type="dxa"/>
-              <w:start w:w="90" w:type="dxa"/>
-              <w:bottom w:w="60" w:type="dxa"/>
-              <w:end w:w="90" w:type="dxa"/>
-            </w:tcMar>
-            <w:vAlign w:val="center"/>
-          </w:tcPr>
-          <w:p>
-            <w:pPr>
-              <w:spacing w:before="0" w:after="0" w:line="240" w:lineRule="auto"/>
-            </w:pPr>
-            <w:r>
-              <w:rPr>
-                <w:rFonts w:ascii="Calibri" w:hAnsi="Calibri"/>
-                <w:b w:val="0"/>
-                <w:sz w:val="17"/>
-              </w:rPr>
-              <w:t>Module (request) -&gt; /modules/y8s-m05/#m05-s03</w:t>
-              <w:br/>
-            </w:r>
-            <w:r>
-              <w:rPr>
-                <w:rFonts w:ascii="Calibri" w:hAnsi="Calibri"/>
-                <w:b w:val="0"/>
-                <w:sz w:val="17"/>
-              </w:rPr>
-              <w:t>Theory (request) -&gt; /theory.html#theory-m05-s03-question-and-evidence</w:t>
-              <w:br/>
-            </w:r>
-            <w:r>
-              <w:rPr>
-                <w:rFonts w:ascii="Calibri" w:hAnsi="Calibri"/>
-                <w:b w:val="0"/>
-                <w:sz w:val="17"/>
-              </w:rPr>
-              <w:t>Check (request) -&gt; /theory.html#check-m05-s03</w:t>
-              <w:br/>
-            </w:r>
-            <w:r>
-              <w:rPr>
-                <w:rFonts w:ascii="Calibri" w:hAnsi="Calibri"/>
-                <w:b w:val="0"/>
-                <w:sz w:val="17"/>
-              </w:rPr>
-              <w:t>Response (request) -&gt; /theory.html#response-m05-s03</w:t>
-              <w:br/>
-            </w:r>
-            <w:r>
-              <w:rPr>
-                <w:rFonts w:ascii="Calibri" w:hAnsi="Calibri"/>
-                <w:b w:val="0"/>
-                <w:sz w:val="17"/>
-              </w:rPr>
-              <w:t>Busy Work (request) -&gt; /busy-work/#bw-m05-s03</w:t>
-              <w:br/>
-            </w:r>
-            <w:r>
-              <w:rPr>
-                <w:rFonts w:ascii="Calibri" w:hAnsi="Calibri"/>
-                <w:b w:val="0"/>
-                <w:sz w:val="17"/>
-              </w:rPr>
-              <w:t>Video (request) -&gt; /youtube-learning/#video-m05-s03</w:t>
-              <w:br/>
-            </w:r>
-            <w:r>
-              <w:rPr>
-                <w:rFonts w:ascii="Calibri" w:hAnsi="Calibri"/>
-                <w:b w:val="0"/>
-                <w:sz w:val="17"/>
-              </w:rPr>
-              <w:t>Folio (blocked) -&gt; /folio/#record-m05-s03</w:t>
             </w:r>
           </w:p>
         </w:tc>

</xml_diff>